<commit_message>
docs(hds): mise a jour de l'url officielle de l'annuaire HDS de l'ANS
</commit_message>
<xml_diff>
--- a/docx/07_Conformite_HDS.docx
+++ b/docx/07_Conformite_HDS.docx
@@ -653,7 +653,7 @@
         <w:br/>
       </w:r>
       <w:r>
-        <w:t xml:space="preserve">La liste exhaustive des hébergeurs certifiés HDS délivrée par les organismes accrédités (AFNOR, Bureau Veritas, BSI, LSTI) est librement consultable en ligne sur le portail ministériel :</w:t>
+        <w:t xml:space="preserve">La liste exhaustive des hébergeurs certifiés HDS délivrée par les organismes accrédités (AFNOR, Bureau Veritas, BSI, LSTI) est librement consultable en ligne sur le portail ministériel de l’ANS :</w:t>
       </w:r>
       <w:r>
         <w:br/>
@@ -669,7 +669,7 @@
           <w:rPr>
             <w:rStyle w:val="Hyperlink"/>
           </w:rPr>
-          <w:t xml:space="preserve">https://esante.gouv.fr/labels-certifications/hds/liste-des-hebergeurs-certifies</w:t>
+          <w:t xml:space="preserve">https://esante.gouv.fr/offres-services/hds/liste-des-hebergeurs-certifies</w:t>
         </w:r>
       </w:hyperlink>
     </w:p>

</xml_diff>

<commit_message>
docs(hds): precision exacte des activites HDS et organismes certificateurs (Scaleway 1-4 BSI Group, Scalingo 1-6 BYCYB)
</commit_message>
<xml_diff>
--- a/docx/07_Conformite_HDS.docx
+++ b/docx/07_Conformite_HDS.docx
@@ -201,11 +201,12 @@
         <w:tblLook w:firstRow="1" w:lastRow="0" w:firstColumn="0" w:lastColumn="0" w:noHBand="0" w:noVBand="0" w:val="0020"/>
       </w:tblPr>
       <w:tblGrid>
-        <w:gridCol w:w="1584"/>
-        <w:gridCol w:w="1584"/>
-        <w:gridCol w:w="1584"/>
-        <w:gridCol w:w="1584"/>
-        <w:gridCol w:w="1584"/>
+        <w:gridCol w:w="1320"/>
+        <w:gridCol w:w="1320"/>
+        <w:gridCol w:w="1320"/>
+        <w:gridCol w:w="1320"/>
+        <w:gridCol w:w="1320"/>
+        <w:gridCol w:w="1320"/>
       </w:tblGrid>
       <w:tr>
         <w:trPr>
@@ -251,7 +252,18 @@
               <w:pStyle w:val="Compact"/>
             </w:pPr>
             <w:r>
-              <w:t xml:space="preserve">Certifications Détenues</w:t>
+              <w:t xml:space="preserve">Certifications Détenues (Référentiel ANS HDS v2.0)</w:t>
+            </w:r>
+          </w:p>
+        </w:tc>
+        <w:tc>
+          <w:tcPr/>
+          <w:p>
+            <w:pPr>
+              <w:pStyle w:val="Compact"/>
+            </w:pPr>
+            <w:r>
+              <w:t xml:space="preserve">Organisme Certificateur</w:t>
             </w:r>
           </w:p>
         </w:tc>
@@ -338,13 +350,10 @@
                 <w:b/>
                 <w:bCs/>
               </w:rPr>
-              <w:t xml:space="preserve">HDS v2.0</w:t>
-            </w:r>
-            <w:r>
-              <w:t xml:space="preserve"> </w:t>
-            </w:r>
-            <w:r>
-              <w:t xml:space="preserve">(Activités 1 à 6)</w:t>
+              <w:t xml:space="preserve">HDS v2.0 : Activités 1, 2, 3, 4, 5, 6</w:t>
+            </w:r>
+            <w:r>
+              <w:t xml:space="preserve">• Hébergeur d’Infrastructures &amp; Infogéreur</w:t>
             </w:r>
             <w:r>
               <w:t xml:space="preserve">•</w:t>
@@ -359,8 +368,20 @@
               </w:rPr>
               <w:t xml:space="preserve">ISO 27001:2022</w:t>
             </w:r>
-            <w:r>
-              <w:t xml:space="preserve">• Hébergeur d’Infrastructures &amp; Infogéreur</w:t>
+          </w:p>
+        </w:tc>
+        <w:tc>
+          <w:tcPr/>
+          <w:p>
+            <w:pPr>
+              <w:pStyle w:val="Compact"/>
+            </w:pPr>
+            <w:r>
+              <w:rPr>
+                <w:b/>
+                <w:bCs/>
+              </w:rPr>
+              <w:t xml:space="preserve">BYCYB</w:t>
             </w:r>
           </w:p>
         </w:tc>
@@ -375,7 +396,7 @@
                 <w:rPr>
                   <w:rStyle w:val="Hyperlink"/>
                 </w:rPr>
-                <w:t xml:space="preserve">Consulter sur esante.gouv.fr</w:t>
+                <w:t xml:space="preserve">Fiche officielle ANS</w:t>
               </w:r>
             </w:hyperlink>
           </w:p>
@@ -467,13 +488,13 @@
                 <w:b/>
                 <w:bCs/>
               </w:rPr>
-              <w:t xml:space="preserve">HDS v2.0</w:t>
+              <w:t xml:space="preserve">HDS v2.0 : Activités 1, 2, 3, 4</w:t>
             </w:r>
             <w:r>
               <w:t xml:space="preserve"> </w:t>
             </w:r>
             <w:r>
-              <w:t xml:space="preserve">(Activités 1 à 6)</w:t>
+              <w:t xml:space="preserve">(Hébergeur d’Infrastructure Physique et Virtuelle)</w:t>
             </w:r>
             <w:r>
               <w:t xml:space="preserve">•</w:t>
@@ -489,23 +510,25 @@
               <w:t xml:space="preserve">ISO 27001:2022</w:t>
             </w:r>
             <w:r>
-              <w:t xml:space="preserve">•</w:t>
-            </w:r>
-            <w:r>
               <w:t xml:space="preserve"> </w:t>
             </w:r>
+            <w:r>
+              <w:t xml:space="preserve">/ ISO 50001</w:t>
+            </w:r>
+          </w:p>
+        </w:tc>
+        <w:tc>
+          <w:tcPr/>
+          <w:p>
+            <w:pPr>
+              <w:pStyle w:val="Compact"/>
+            </w:pPr>
             <w:r>
               <w:rPr>
                 <w:b/>
                 <w:bCs/>
               </w:rPr>
-              <w:t xml:space="preserve">ISO 50001</w:t>
-            </w:r>
-            <w:r>
-              <w:t xml:space="preserve"> </w:t>
-            </w:r>
-            <w:r>
-              <w:t xml:space="preserve">/ Souveraineté UE</w:t>
+              <w:t xml:space="preserve">BSI Group</w:t>
             </w:r>
           </w:p>
         </w:tc>
@@ -520,7 +543,7 @@
                 <w:rPr>
                   <w:rStyle w:val="Hyperlink"/>
                 </w:rPr>
-                <w:t xml:space="preserve">Consulter sur esante.gouv.fr</w:t>
+                <w:t xml:space="preserve">Fiche officielle ANS</w:t>
               </w:r>
             </w:hyperlink>
           </w:p>
@@ -628,11 +651,22 @@
               <w:pStyle w:val="Compact"/>
             </w:pPr>
             <w:r>
+              <w:t xml:space="preserve">SQS</w:t>
+            </w:r>
+          </w:p>
+        </w:tc>
+        <w:tc>
+          <w:tcPr/>
+          <w:p>
+            <w:pPr>
+              <w:pStyle w:val="Compact"/>
+            </w:pPr>
+            <w:r>
               <w:rPr>
                 <w:i/>
                 <w:iCs/>
               </w:rPr>
-              <w:t xml:space="preserve">N/A (Uniquement métadonnées techniques)</w:t>
+              <w:t xml:space="preserve">N/A (Métadonnées techniques)</w:t>
             </w:r>
           </w:p>
         </w:tc>
@@ -653,7 +687,7 @@
         <w:br/>
       </w:r>
       <w:r>
-        <w:t xml:space="preserve">La liste exhaustive des hébergeurs certifiés HDS délivrée par les organismes accrédités (AFNOR, Bureau Veritas, BSI, LSTI) est librement consultable en ligne sur le portail ministériel de l’ANS :</w:t>
+        <w:t xml:space="preserve">La liste exhaustive des hébergeurs certifiés HDS délivrée par les organismes accrédités (BYCYB, BSI Group, AFNOR, Bureau Veritas) est librement consultable en ligne sur le portail ministériel de l’ANS :</w:t>
       </w:r>
       <w:r>
         <w:br/>
@@ -681,13 +715,13 @@
       </w:r>
     </w:p>
     <w:bookmarkEnd w:id="11"/>
-    <w:bookmarkStart w:id="12" w:name="X338415a3a44f5a13226702ab9604438c7659037"/>
+    <w:bookmarkStart w:id="12" w:name="Xf5cfb5c360914f19056a86e58b6ac2ea8c6d930"/>
     <w:p>
       <w:pPr>
         <w:pStyle w:val="Heading2"/>
       </w:pPr>
       <w:r>
-        <w:t xml:space="preserve">3. Matrice des 6 Activités du Référentiel HDS</w:t>
+        <w:t xml:space="preserve">3. Matrice des Activités du Référentiel HDS (Complémentarité Parfaite)</w:t>
       </w:r>
     </w:p>
     <w:p>
@@ -695,7 +729,23 @@
         <w:pStyle w:val="FirstParagraph"/>
       </w:pPr>
       <w:r>
-        <w:t xml:space="preserve">Le référentiel HDS de l’ANS définit 6 activités réglementaires. La chaîne de confiance MacroscopiX couvre l’ensemble de ce périmètre :</w:t>
+        <w:t xml:space="preserve">Le référentiel HDS de l’ANS définit 6 activités réglementaires. Le couple</w:t>
+      </w:r>
+      <w:r>
+        <w:t xml:space="preserve"> </w:t>
+      </w:r>
+      <w:r>
+        <w:rPr>
+          <w:b/>
+          <w:bCs/>
+        </w:rPr>
+        <w:t xml:space="preserve">Scalingo + Scaleway</w:t>
+      </w:r>
+      <w:r>
+        <w:t xml:space="preserve"> </w:t>
+      </w:r>
+      <w:r>
+        <w:t xml:space="preserve">assure une couverture totale et rigoureusement conforme :</w:t>
       </w:r>
     </w:p>
     <w:tbl>
@@ -706,9 +756,10 @@
         <w:tblLook w:firstRow="1" w:lastRow="0" w:firstColumn="0" w:lastColumn="0" w:noHBand="0" w:noVBand="0" w:val="0020"/>
       </w:tblPr>
       <w:tblGrid>
-        <w:gridCol w:w="2640"/>
-        <w:gridCol w:w="2640"/>
-        <w:gridCol w:w="2640"/>
+        <w:gridCol w:w="1980"/>
+        <w:gridCol w:w="1980"/>
+        <w:gridCol w:w="1980"/>
+        <w:gridCol w:w="1980"/>
       </w:tblGrid>
       <w:tr>
         <w:trPr>
@@ -732,18 +783,29 @@
               <w:pStyle w:val="Compact"/>
             </w:pPr>
             <w:r>
-              <w:t xml:space="preserve">Libellé Réglementaire</w:t>
-            </w:r>
-          </w:p>
-        </w:tc>
-        <w:tc>
-          <w:tcPr/>
-          <w:p>
-            <w:pPr>
-              <w:pStyle w:val="Compact"/>
-            </w:pPr>
-            <w:r>
-              <w:t xml:space="preserve">Prestataire Couvrant</w:t>
+              <w:t xml:space="preserve">Libellé Réglementaire de l’ANS</w:t>
+            </w:r>
+          </w:p>
+        </w:tc>
+        <w:tc>
+          <w:tcPr/>
+          <w:p>
+            <w:pPr>
+              <w:pStyle w:val="Compact"/>
+            </w:pPr>
+            <w:r>
+              <w:t xml:space="preserve">Prestataire Assurant le Périmètre</w:t>
+            </w:r>
+          </w:p>
+        </w:tc>
+        <w:tc>
+          <w:tcPr/>
+          <w:p>
+            <w:pPr>
+              <w:pStyle w:val="Compact"/>
+            </w:pPr>
+            <w:r>
+              <w:t xml:space="preserve">Organisme Certificateur</w:t>
             </w:r>
           </w:p>
         </w:tc>
@@ -782,7 +844,18 @@
               <w:pStyle w:val="Compact"/>
             </w:pPr>
             <w:r>
-              <w:t xml:space="preserve">Scalingo / Scaleway</w:t>
+              <w:t xml:space="preserve">Scaleway &amp; Scalingo</w:t>
+            </w:r>
+          </w:p>
+        </w:tc>
+        <w:tc>
+          <w:tcPr/>
+          <w:p>
+            <w:pPr>
+              <w:pStyle w:val="Compact"/>
+            </w:pPr>
+            <w:r>
+              <w:t xml:space="preserve">BSI Group / BYCYB</w:t>
             </w:r>
           </w:p>
         </w:tc>
@@ -821,7 +894,18 @@
               <w:pStyle w:val="Compact"/>
             </w:pPr>
             <w:r>
-              <w:t xml:space="preserve">Scalingo / Scaleway</w:t>
+              <w:t xml:space="preserve">Scaleway &amp; Scalingo</w:t>
+            </w:r>
+          </w:p>
+        </w:tc>
+        <w:tc>
+          <w:tcPr/>
+          <w:p>
+            <w:pPr>
+              <w:pStyle w:val="Compact"/>
+            </w:pPr>
+            <w:r>
+              <w:t xml:space="preserve">BSI Group / BYCYB</w:t>
             </w:r>
           </w:p>
         </w:tc>
@@ -860,7 +944,18 @@
               <w:pStyle w:val="Compact"/>
             </w:pPr>
             <w:r>
-              <w:t xml:space="preserve">Scalingo</w:t>
+              <w:t xml:space="preserve">Scaleway &amp; Scalingo</w:t>
+            </w:r>
+          </w:p>
+        </w:tc>
+        <w:tc>
+          <w:tcPr/>
+          <w:p>
+            <w:pPr>
+              <w:pStyle w:val="Compact"/>
+            </w:pPr>
+            <w:r>
+              <w:t xml:space="preserve">BSI Group / BYCYB</w:t>
             </w:r>
           </w:p>
         </w:tc>
@@ -899,7 +994,18 @@
               <w:pStyle w:val="Compact"/>
             </w:pPr>
             <w:r>
-              <w:t xml:space="preserve">Scalingo / Scaleway</w:t>
+              <w:t xml:space="preserve">Scaleway &amp; Scalingo</w:t>
+            </w:r>
+          </w:p>
+        </w:tc>
+        <w:tc>
+          <w:tcPr/>
+          <w:p>
+            <w:pPr>
+              <w:pStyle w:val="Compact"/>
+            </w:pPr>
+            <w:r>
+              <w:t xml:space="preserve">BSI Group / BYCYB</w:t>
             </w:r>
           </w:p>
         </w:tc>
@@ -938,7 +1044,32 @@
               <w:pStyle w:val="Compact"/>
             </w:pPr>
             <w:r>
-              <w:t xml:space="preserve">Scalingo / Scaleway</w:t>
+              <w:rPr>
+                <w:b/>
+                <w:bCs/>
+              </w:rPr>
+              <w:t xml:space="preserve">Scalingo</w:t>
+            </w:r>
+            <w:r>
+              <w:t xml:space="preserve"> </w:t>
+            </w:r>
+            <w:r>
+              <w:rPr>
+                <w:i/>
+                <w:iCs/>
+              </w:rPr>
+              <w:t xml:space="preserve">(Infogéreur certifié)</w:t>
+            </w:r>
+          </w:p>
+        </w:tc>
+        <w:tc>
+          <w:tcPr/>
+          <w:p>
+            <w:pPr>
+              <w:pStyle w:val="Compact"/>
+            </w:pPr>
+            <w:r>
+              <w:t xml:space="preserve">BYCYB</w:t>
             </w:r>
           </w:p>
         </w:tc>
@@ -977,7 +1108,32 @@
               <w:pStyle w:val="Compact"/>
             </w:pPr>
             <w:r>
-              <w:t xml:space="preserve">Scaleway (Object Storage Multi-AZ)</w:t>
+              <w:rPr>
+                <w:b/>
+                <w:bCs/>
+              </w:rPr>
+              <w:t xml:space="preserve">Scalingo</w:t>
+            </w:r>
+            <w:r>
+              <w:t xml:space="preserve"> </w:t>
+            </w:r>
+            <w:r>
+              <w:rPr>
+                <w:i/>
+                <w:iCs/>
+              </w:rPr>
+              <w:t xml:space="preserve">(Couverture globale du flux)</w:t>
+            </w:r>
+          </w:p>
+        </w:tc>
+        <w:tc>
+          <w:tcPr/>
+          <w:p>
+            <w:pPr>
+              <w:pStyle w:val="Compact"/>
+            </w:pPr>
+            <w:r>
+              <w:t xml:space="preserve">BYCYB</w:t>
             </w:r>
           </w:p>
         </w:tc>

</xml_diff>